<commit_message>
feat: adicao de novos agravos (sifilis, varicela, zika, toxoplasmose, creutzfeldt_jakob) e limpeza de arquivos legados
</commit_message>
<xml_diff>
--- a/Documentacao/Digitador_SINAN.docx
+++ b/Documentacao/Digitador_SINAN.docx
@@ -416,15 +416,9 @@
       </w:r>
     </w:p>
     <w:p>
-      <w:r>
-        <w:t xml:space="preserve"> git clone https://github.com/ggtidev/etl_redcap_sinan.git 1_etl_redcap_sinan</w:t>
-      </w:r>
-    </w:p>
-    <w:p>
-      <w:pPr>
-        <w:rPr>
-          <w:b/>
-          <w:bCs/>
+      <w:pPr>
+        <w:rPr>
+          <w:lang w:val="en-US"/>
         </w:rPr>
       </w:pPr>
       <w:r>
@@ -432,6 +426,26 @@
       </w:r>
       <w:r>
         <w:rPr>
+          <w:lang w:val="en-US"/>
+        </w:rPr>
+        <w:t>git clone https://github.com/ggtidev/etl_redcap_sinan.git 1_etl_redcap_sinan</w:t>
+      </w:r>
+    </w:p>
+    <w:p>
+      <w:pPr>
+        <w:rPr>
+          <w:b/>
+          <w:bCs/>
+        </w:rPr>
+      </w:pPr>
+      <w:r>
+        <w:rPr>
+          <w:lang w:val="en-US"/>
+        </w:rPr>
+        <w:t xml:space="preserve"> </w:t>
+      </w:r>
+      <w:r>
+        <w:rPr>
           <w:b/>
           <w:bCs/>
         </w:rPr>
@@ -459,15 +473,56 @@
       </w:r>
     </w:p>
     <w:p>
-      <w:r>
-        <w:t xml:space="preserve"> git clone https://github.com/ggtidev/sinan_rpa.git 3_sinan_rpa</w:t>
-      </w:r>
-    </w:p>
-    <w:p/>
-    <w:p/>
-    <w:p/>
-    <w:p/>
-    <w:p/>
+      <w:pPr>
+        <w:rPr>
+          <w:lang w:val="en-US"/>
+        </w:rPr>
+      </w:pPr>
+      <w:r>
+        <w:t xml:space="preserve"> </w:t>
+      </w:r>
+      <w:r>
+        <w:rPr>
+          <w:lang w:val="en-US"/>
+        </w:rPr>
+        <w:t>git clone https://github.com/ggtidev/sinan_rpa.git 3_sinan_rpa</w:t>
+      </w:r>
+    </w:p>
+    <w:p>
+      <w:pPr>
+        <w:rPr>
+          <w:lang w:val="en-US"/>
+        </w:rPr>
+      </w:pPr>
+    </w:p>
+    <w:p>
+      <w:pPr>
+        <w:rPr>
+          <w:lang w:val="en-US"/>
+        </w:rPr>
+      </w:pPr>
+    </w:p>
+    <w:p>
+      <w:pPr>
+        <w:rPr>
+          <w:lang w:val="en-US"/>
+        </w:rPr>
+      </w:pPr>
+    </w:p>
+    <w:p>
+      <w:pPr>
+        <w:rPr>
+          <w:lang w:val="en-US"/>
+        </w:rPr>
+      </w:pPr>
+    </w:p>
+    <w:p>
+      <w:pPr>
+        <w:rPr>
+          <w:lang w:val="en-US"/>
+        </w:rPr>
+      </w:pPr>
+    </w:p>
     <w:p>
       <w:pPr>
         <w:jc w:val="center"/>
@@ -5297,12 +5352,203 @@
       </w:r>
     </w:p>
     <w:p>
+      <w:pPr>
+        <w:tabs>
+          <w:tab w:val="left" w:pos="2250"/>
+        </w:tabs>
+      </w:pPr>
       <w:r>
         <w:t>3_sinan_rpa</w:t>
       </w:r>
+      <w:r>
+        <w:tab/>
+      </w:r>
+    </w:p>
+    <w:p>
+      <w:pPr>
+        <w:tabs>
+          <w:tab w:val="left" w:pos="2250"/>
+        </w:tabs>
+      </w:pPr>
+    </w:p>
+    <w:p>
+      <w:pPr>
+        <w:tabs>
+          <w:tab w:val="left" w:pos="2250"/>
+        </w:tabs>
+      </w:pPr>
+    </w:p>
+    <w:p>
+      <w:pPr>
+        <w:tabs>
+          <w:tab w:val="left" w:pos="2250"/>
+        </w:tabs>
+      </w:pPr>
+    </w:p>
+    <w:p>
+      <w:pPr>
+        <w:tabs>
+          <w:tab w:val="left" w:pos="2250"/>
+        </w:tabs>
+      </w:pPr>
+    </w:p>
+    <w:p>
+      <w:pPr>
+        <w:tabs>
+          <w:tab w:val="left" w:pos="2250"/>
+        </w:tabs>
+      </w:pPr>
+    </w:p>
+    <w:p>
+      <w:pPr>
+        <w:tabs>
+          <w:tab w:val="left" w:pos="2250"/>
+        </w:tabs>
+      </w:pPr>
+    </w:p>
+    <w:p>
+      <w:pPr>
+        <w:tabs>
+          <w:tab w:val="left" w:pos="2250"/>
+        </w:tabs>
+      </w:pPr>
+    </w:p>
+    <w:p>
+      <w:pPr>
+        <w:tabs>
+          <w:tab w:val="left" w:pos="2250"/>
+        </w:tabs>
+      </w:pPr>
+    </w:p>
+    <w:p>
+      <w:pPr>
+        <w:tabs>
+          <w:tab w:val="left" w:pos="2250"/>
+        </w:tabs>
+      </w:pPr>
+    </w:p>
+    <w:p>
+      <w:pPr>
+        <w:tabs>
+          <w:tab w:val="left" w:pos="2250"/>
+        </w:tabs>
+      </w:pPr>
+    </w:p>
+    <w:p>
+      <w:pPr>
+        <w:tabs>
+          <w:tab w:val="left" w:pos="2250"/>
+        </w:tabs>
+      </w:pPr>
+    </w:p>
+    <w:p>
+      <w:pPr>
+        <w:tabs>
+          <w:tab w:val="left" w:pos="2250"/>
+        </w:tabs>
+      </w:pPr>
+    </w:p>
+    <w:p>
+      <w:pPr>
+        <w:tabs>
+          <w:tab w:val="left" w:pos="2250"/>
+        </w:tabs>
+      </w:pPr>
+      <w:r>
+        <w:lastRenderedPageBreak/>
+        <w:t>34(Ocupação)</w:t>
+      </w:r>
+    </w:p>
+    <w:p>
+      <w:pPr>
+        <w:tabs>
+          <w:tab w:val="left" w:pos="2250"/>
+        </w:tabs>
+      </w:pPr>
+      <w:r>
+        <w:rPr>
+          <w:noProof/>
+        </w:rPr>
+        <w:drawing>
+          <wp:inline distT="0" distB="0" distL="0" distR="0" wp14:anchorId="34CE81E7" wp14:editId="63DD9DB8">
+            <wp:extent cx="4171950" cy="3338934"/>
+            <wp:effectExtent l="0" t="0" r="0" b="0"/>
+            <wp:docPr id="232037305" name="Imagem 1"/>
+            <wp:cNvGraphicFramePr>
+              <a:graphicFrameLocks xmlns:a="http://schemas.openxmlformats.org/drawingml/2006/main" noChangeAspect="1"/>
+            </wp:cNvGraphicFramePr>
+            <a:graphic xmlns:a="http://schemas.openxmlformats.org/drawingml/2006/main">
+              <a:graphicData uri="http://schemas.openxmlformats.org/drawingml/2006/picture">
+                <pic:pic xmlns:pic="http://schemas.openxmlformats.org/drawingml/2006/picture">
+                  <pic:nvPicPr>
+                    <pic:cNvPr id="232037305" name=""/>
+                    <pic:cNvPicPr/>
+                  </pic:nvPicPr>
+                  <pic:blipFill>
+                    <a:blip r:embed="rId6"/>
+                    <a:stretch>
+                      <a:fillRect/>
+                    </a:stretch>
+                  </pic:blipFill>
+                  <pic:spPr>
+                    <a:xfrm>
+                      <a:off x="0" y="0"/>
+                      <a:ext cx="4176118" cy="3342270"/>
+                    </a:xfrm>
+                    <a:prstGeom prst="rect">
+                      <a:avLst/>
+                    </a:prstGeom>
+                  </pic:spPr>
+                </pic:pic>
+              </a:graphicData>
+            </a:graphic>
+          </wp:inline>
+        </w:drawing>
+      </w:r>
     </w:p>
     <w:p/>
-    <w:p/>
+    <w:p>
+      <w:r>
+        <w:rPr>
+          <w:noProof/>
+        </w:rPr>
+        <w:drawing>
+          <wp:inline distT="0" distB="0" distL="0" distR="0" wp14:anchorId="73EBBD01" wp14:editId="45A952C5">
+            <wp:extent cx="4152900" cy="2972078"/>
+            <wp:effectExtent l="0" t="0" r="0" b="0"/>
+            <wp:docPr id="1446494104" name="Imagem 1"/>
+            <wp:cNvGraphicFramePr>
+              <a:graphicFrameLocks xmlns:a="http://schemas.openxmlformats.org/drawingml/2006/main" noChangeAspect="1"/>
+            </wp:cNvGraphicFramePr>
+            <a:graphic xmlns:a="http://schemas.openxmlformats.org/drawingml/2006/main">
+              <a:graphicData uri="http://schemas.openxmlformats.org/drawingml/2006/picture">
+                <pic:pic xmlns:pic="http://schemas.openxmlformats.org/drawingml/2006/picture">
+                  <pic:nvPicPr>
+                    <pic:cNvPr id="1446494104" name=""/>
+                    <pic:cNvPicPr/>
+                  </pic:nvPicPr>
+                  <pic:blipFill>
+                    <a:blip r:embed="rId7"/>
+                    <a:stretch>
+                      <a:fillRect/>
+                    </a:stretch>
+                  </pic:blipFill>
+                  <pic:spPr>
+                    <a:xfrm>
+                      <a:off x="0" y="0"/>
+                      <a:ext cx="4156912" cy="2974949"/>
+                    </a:xfrm>
+                    <a:prstGeom prst="rect">
+                      <a:avLst/>
+                    </a:prstGeom>
+                  </pic:spPr>
+                </pic:pic>
+              </a:graphicData>
+            </a:graphic>
+          </wp:inline>
+        </w:drawing>
+      </w:r>
+    </w:p>
     <w:sectPr>
       <w:pgSz w:w="11906" w:h="16838"/>
       <w:pgMar w:top="1417" w:right="1701" w:bottom="1417" w:left="1701" w:header="708" w:footer="708" w:gutter="0"/>
@@ -7328,6 +7574,7 @@
   <w:style w:type="character" w:default="1" w:styleId="Fontepargpadro">
     <w:name w:val="Default Paragraph Font"/>
     <w:uiPriority w:val="1"/>
+    <w:semiHidden/>
     <w:unhideWhenUsed/>
   </w:style>
   <w:style w:type="table" w:default="1" w:styleId="Tabelanormal">

</xml_diff>